<commit_message>
Update ID on reports "Afk Reminder Letter and SalesInvoiceEmail"
</commit_message>
<xml_diff>
--- a/Source/Report/Layout/AfkReminderLetter.docx
+++ b/Source/Report/Layout/AfkReminderLetter.docx
@@ -1,6 +1,6 @@
 
 <file path=word/document.xml><?xml version="1.0" encoding="utf-8"?>
-<w:document xmlns:wpc="http://schemas.microsoft.com/office/word/2010/wordprocessingCanvas" xmlns:mc="http://schemas.openxmlformats.org/markup-compatibility/2006" xmlns:o="urn:schemas-microsoft-com:office:office" xmlns:r="http://schemas.openxmlformats.org/officeDocument/2006/relationships" xmlns:m="http://schemas.openxmlformats.org/officeDocument/2006/math" xmlns:v="urn:schemas-microsoft-com:vml" xmlns:wp14="http://schemas.microsoft.com/office/word/2010/wordprocessingDrawing" xmlns:wp="http://schemas.openxmlformats.org/drawingml/2006/wordprocessingDrawing" xmlns:w10="urn:schemas-microsoft-com:office:word" xmlns:w="http://schemas.openxmlformats.org/wordprocessingml/2006/main" xmlns:w14="http://schemas.microsoft.com/office/word/2010/wordml" xmlns:w15="http://schemas.microsoft.com/office/word/2012/wordml" xmlns:wpg="http://schemas.microsoft.com/office/word/2010/wordprocessingGroup" xmlns:wpi="http://schemas.microsoft.com/office/word/2010/wordprocessingInk" xmlns:wne="http://schemas.microsoft.com/office/word/2006/wordml" xmlns:wps="http://schemas.microsoft.com/office/word/2010/wordprocessingShape" mc:Ignorable="w14 w15 wp14">
+<w:document xmlns:a="http://schemas.openxmlformats.org/drawingml/2006/main" xmlns:wpc="http://schemas.microsoft.com/office/word/2010/wordprocessingCanvas" xmlns:mc="http://schemas.openxmlformats.org/markup-compatibility/2006" xmlns:o="urn:schemas-microsoft-com:office:office" xmlns:r="http://schemas.openxmlformats.org/officeDocument/2006/relationships" xmlns:m="http://schemas.openxmlformats.org/officeDocument/2006/math" xmlns:v="urn:schemas-microsoft-com:vml" xmlns:wp14="http://schemas.microsoft.com/office/word/2010/wordprocessingDrawing" xmlns:wp="http://schemas.openxmlformats.org/drawingml/2006/wordprocessingDrawing" xmlns:w10="urn:schemas-microsoft-com:office:word" xmlns:w="http://schemas.openxmlformats.org/wordprocessingml/2006/main" xmlns:w14="http://schemas.microsoft.com/office/word/2010/wordml" xmlns:w15="http://schemas.microsoft.com/office/word/2012/wordml" xmlns:wpg="http://schemas.microsoft.com/office/word/2010/wordprocessingGroup" xmlns:wpi="http://schemas.microsoft.com/office/word/2010/wordprocessingInk" xmlns:wne="http://schemas.microsoft.com/office/word/2006/wordml" xmlns:wps="http://schemas.microsoft.com/office/word/2010/wordprocessingShape" mc:Ignorable="w14 w15 wp14">
   <w:body>
     <w:p>
       <w:pPr>
@@ -159,7 +159,7 @@
                       </wps:style>
                       <wps:txbx>
                         <w:txbxContent>
-                          <w:bookmarkStart w:id="0" w:name="_GoBack" w:displacedByCustomXml="next"/>
+                          <w:bookmarkStart w:name="_GoBack" w:displacedByCustomXml="next" w:id="0"/>
                           <w:sdt>
                             <w:sdtPr>
                               <w:rPr>
@@ -168,12 +168,12 @@
                                 <w:szCs w:val="24"/>
                               </w:rPr>
                               <w:alias w:val="#Nav: /Issued_Reminder_Header/ManagerNameLbl"/>
-                              <w:tag w:val="#Nav: Afk_Reminder_Letter/50200"/>
+                              <w:tag w:val="#Nav: Afk_Reminder_Letter/50080"/>
                               <w:id w:val="-374389175"/>
                               <w:placeholder>
                                 <w:docPart w:val="DefaultPlaceholder_1081868574"/>
                               </w:placeholder>
-                              <w:dataBinding w:prefixMappings="xmlns:ns0='urn:microsoft-dynamics-nav/reports/Afk_Reminder_Letter/50200/'" w:xpath="/ns0:NavWordReportXmlPart[1]/ns0:Issued_Reminder_Header[1]/ns0:ManagerNameLbl[1]" w:storeItemID="{C2919238-2EF0-415B-9CA8-0252CB99B710}"/>
+                              <w:dataBinding w:prefixMappings="xmlns:ns0='urn:microsoft-dynamics-nav/reports/Afk_Reminder_Letter/50080/'" w:xpath="/ns0:NavWordReportXmlPart[1]/ns0:Issued_Reminder_Header[1]/ns0:ManagerNameLbl[1]" w:storeItemID="{C2919238-2EF0-415B-9CA8-0252CB99B710}"/>
                               <w:text/>
                             </w:sdtPr>
                             <w:sdtEndPr/>
@@ -198,7 +198,7 @@
                               </w:p>
                             </w:sdtContent>
                           </w:sdt>
-                          <w:bookmarkEnd w:id="0" w:displacedByCustomXml="prev"/>
+                          <w:bookmarkEnd w:displacedByCustomXml="prev" w:id="0"/>
                         </w:txbxContent>
                       </wps:txbx>
                       <wps:bodyPr rot="0" spcFirstLastPara="0" vertOverflow="overflow" horzOverflow="overflow" vert="horz" wrap="square" lIns="91440" tIns="45720" rIns="91440" bIns="45720" numCol="1" spcCol="0" rtlCol="0" fromWordArt="0" anchor="t" anchorCtr="0" forceAA="0" compatLnSpc="1">
@@ -222,10 +222,10 @@
                 <v:stroke joinstyle="miter"/>
                 <v:path gradientshapeok="t" o:connecttype="rect"/>
               </v:shapetype>
-              <v:shape id="Zone de texte 1" o:spid="_x0000_s1026" type="#_x0000_t202" style="position:absolute;left:0;text-align:left;margin-left:244.8pt;margin-top:17.8pt;width:142.5pt;height:21.5pt;z-index:251659264;visibility:visible;mso-wrap-style:square;mso-width-percent:0;mso-wrap-distance-left:9pt;mso-wrap-distance-top:0;mso-wrap-distance-right:9pt;mso-wrap-distance-bottom:0;mso-position-horizontal:absolute;mso-position-horizontal-relative:text;mso-position-vertical:absolute;mso-position-vertical-relative:text;mso-width-percent:0;mso-width-relative:margin;v-text-anchor:top" o:gfxdata="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" fillcolor="white [3201]" stroked="f" strokeweight=".5pt">
+              <v:shape id="Zone de texte 1" style="position:absolute;left:0;text-align:left;margin-left:244.8pt;margin-top:17.8pt;width:142.5pt;height:21.5pt;z-index:251659264;visibility:visible;mso-wrap-style:square;mso-width-percent:0;mso-wrap-distance-left:9pt;mso-wrap-distance-top:0;mso-wrap-distance-right:9pt;mso-wrap-distance-bottom:0;mso-position-horizontal:absolute;mso-position-horizontal-relative:text;mso-position-vertical:absolute;mso-position-vertical-relative:text;mso-width-percent:0;mso-width-relative:margin;v-text-anchor:top" o:spid="_x0000_s1026" fillcolor="white [3201]" stroked="f" strokeweight=".5pt" type="#_x0000_t202" o:gfxdata="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">
                 <v:textbox>
                   <w:txbxContent>
-                    <w:bookmarkStart w:id="1" w:name="_GoBack" w:displacedByCustomXml="next"/>
+                    <w:bookmarkStart w:name="_GoBack" w:displacedByCustomXml="next" w:id="1"/>
                     <w:sdt>
                       <w:sdtPr>
                         <w:rPr>
@@ -234,12 +234,12 @@
                           <w:szCs w:val="24"/>
                         </w:rPr>
                         <w:alias w:val="#Nav: /Issued_Reminder_Header/ManagerNameLbl"/>
-                        <w:tag w:val="#Nav: Afk_Reminder_Letter/50200"/>
+                        <w:tag w:val="#Nav: Afk_Reminder_Letter/50080"/>
                         <w:id w:val="-374389175"/>
                         <w:placeholder>
                           <w:docPart w:val="DefaultPlaceholder_1081868574"/>
                         </w:placeholder>
-                        <w:dataBinding w:prefixMappings="xmlns:ns0='urn:microsoft-dynamics-nav/reports/Afk_Reminder_Letter/50200/'" w:xpath="/ns0:NavWordReportXmlPart[1]/ns0:Issued_Reminder_Header[1]/ns0:ManagerNameLbl[1]" w:storeItemID="{C2919238-2EF0-415B-9CA8-0252CB99B710}"/>
+                        <w:dataBinding w:prefixMappings="xmlns:ns0='urn:microsoft-dynamics-nav/reports/Afk_Reminder_Letter/50080/'" w:xpath="/ns0:NavWordReportXmlPart[1]/ns0:Issued_Reminder_Header[1]/ns0:ManagerNameLbl[1]" w:storeItemID="{C2919238-2EF0-415B-9CA8-0252CB99B710}"/>
                         <w:text/>
                       </w:sdtPr>
                       <w:sdtEndPr/>
@@ -264,7 +264,7 @@
                         </w:p>
                       </w:sdtContent>
                     </w:sdt>
-                    <w:bookmarkEnd w:id="1" w:displacedByCustomXml="prev"/>
+                    <w:bookmarkEnd w:displacedByCustomXml="prev" w:id="1"/>
                   </w:txbxContent>
                 </v:textbox>
               </v:shape>
@@ -1559,7 +1559,9 @@
 </a:theme>
 </file>
 
-<file path=customXml/item1.xml>��< ? x m l   v e r s i o n = " 1 . 0 "   e n c o d i n g = " u t f - 1 6 " ? > < N a v W o r d R e p o r t X m l P a r t   x m l n s = " u r n : m i c r o s o f t - d y n a m i c s - n a v / r e p o r t s / A f k _ R e m i n d e r _ L e t t e r / 5 0 2 0 0 / " > +<file path=customXml/item2.xml>��< ? x m l   v e r s i o n = " 1 . 0 "   e n c o d i n g = " u t f - 1 6 " ? > + 
+ < N a v W o r d R e p o r t X m l P a r t   x m l n s = " u r n : m i c r o s o f t - d y n a m i c s - n a v / r e p o r t s / A f k _ R e m i n d e r _ L e t t e r / 5 0 0 8 0 / " >   
      < I s s u e d _ R e m i n d e r _ H e a d e r >   
@@ -1758,12 +1760,4 @@
      < / I s s u e d _ R e m i n d e r _ H e a d e r >   
  < / N a v W o r d R e p o r t X m l P a r t > 
-</file>
-
-<file path=customXml/itemProps1.xml><?xml version="1.0" encoding="utf-8"?>
-<ds:datastoreItem xmlns:ds="http://schemas.openxmlformats.org/officeDocument/2006/customXml" ds:itemID="{C2919238-2EF0-415B-9CA8-0252CB99B710}">
-  <ds:schemaRefs>
-    <ds:schemaRef ds:uri="urn:microsoft-dynamics-nav/reports/Afk_Reminder_Letter/50200/"/>
-  </ds:schemaRefs>
-</ds:datastoreItem>
 </file>
</xml_diff>